<commit_message>
revise paper against supplied original manuscript
</commit_message>
<xml_diff>
--- a/paper/revised/paper_revised.docx
+++ b/paper/revised/paper_revised.docx
@@ -23,7 +23,73 @@
         <w:pStyle w:val="Date"/>
       </w:pPr>
       <w:r>
-        <w:t xml:space="preserve">2026-07-17</w:t>
+        <w:t xml:space="preserve">2026-07-18</w:t>
+      </w:r>
+    </w:p>
+    <w:p>
+      <w:pPr>
+        <w:pStyle w:val="FirstParagraph"/>
+      </w:pPr>
+      <w:r>
+        <w:rPr>
+          <w:b/>
+          <w:bCs/>
+        </w:rPr>
+        <w:t xml:space="preserve">Awnon Bhowmik¹, Mahmudul Hasan², and Goutam Saha²˒³⁎</w:t>
+      </w:r>
+    </w:p>
+    <w:p>
+      <w:pPr>
+        <w:pStyle w:val="BodyText"/>
+      </w:pPr>
+      <w:r>
+        <w:t xml:space="preserve">¹ College of Engineering &amp; Computer Science, Colorado Technical University,</w:t>
+      </w:r>
+      <w:r>
+        <w:t xml:space="preserve"> </w:t>
+      </w:r>
+      <w:r>
+        <w:t xml:space="preserve">Colorado Springs, CO 80907, USA</w:t>
+      </w:r>
+      <w:r>
+        <w:t xml:space="preserve"> </w:t>
+      </w:r>
+      <w:r>
+        <w:t xml:space="preserve">² Department of Mathematics, University of Dhaka, Dhaka 1000, Bangladesh</w:t>
+      </w:r>
+      <w:r>
+        <w:t xml:space="preserve"> </w:t>
+      </w:r>
+      <w:r>
+        <w:t xml:space="preserve">³ Miyan Research Institute, International University of Business Agriculture</w:t>
+      </w:r>
+      <w:r>
+        <w:t xml:space="preserve"> </w:t>
+      </w:r>
+      <w:r>
+        <w:t xml:space="preserve">and Technology, Uttara, Dhaka 1230, Bangladesh</w:t>
+      </w:r>
+      <w:r>
+        <w:t xml:space="preserve"> </w:t>
+      </w:r>
+      <w:r>
+        <w:t xml:space="preserve">⁎</w:t>
+      </w:r>
+      <w:r>
+        <w:t xml:space="preserve"> </w:t>
+      </w:r>
+      <w:r>
+        <w:rPr>
+          <w:i/>
+          <w:iCs/>
+        </w:rPr>
+        <w:t xml:space="preserve">Correspondence:</w:t>
+      </w:r>
+      <w:r>
+        <w:t xml:space="preserve"> </w:t>
+      </w:r>
+      <w:r>
+        <w:t xml:space="preserve">gsahamath@du.ac.bd</w:t>
       </w:r>
     </w:p>
     <w:bookmarkStart w:id="9" w:name="abstract"/>
@@ -175,19 +241,31 @@
         <w:t xml:space="preserve"> </w:t>
       </w:r>
       <w:r>
-        <w:t xml:space="preserve">only as conditional targets/benchmarks. The audit reverses the legacy declining</w:t>
-      </w:r>
-      <w:r>
-        <w:t xml:space="preserve"> </w:t>
-      </w:r>
-      <w:r>
-        <w:t xml:space="preserve">trend claim and removes unsupported multi-pollutant, source-apportionment,</w:t>
-      </w:r>
-      <w:r>
-        <w:t xml:space="preserve"> </w:t>
-      </w:r>
-      <w:r>
-        <w:t xml:space="preserve">health-burden, and citywide-exposure conclusions.</w:t>
+        <w:t xml:space="preserve">only as conditional targets/benchmarks. PM10, NO2, and SO2 remain important AQI</w:t>
+      </w:r>
+      <w:r>
+        <w:t xml:space="preserve"> </w:t>
+      </w:r>
+      <w:r>
+        <w:t xml:space="preserve">pollutants in principle, but their legacy columns lacked the station, unit, and</w:t>
+      </w:r>
+      <w:r>
+        <w:t xml:space="preserve"> </w:t>
+      </w:r>
+      <w:r>
+        <w:t xml:space="preserve">method continuity required for empirical analysis. The audit reverses the</w:t>
+      </w:r>
+      <w:r>
+        <w:t xml:space="preserve"> </w:t>
+      </w:r>
+      <w:r>
+        <w:t xml:space="preserve">legacy declining trend claim and removes unsupported multi-pollutant,</w:t>
+      </w:r>
+      <w:r>
+        <w:t xml:space="preserve"> </w:t>
+      </w:r>
+      <w:r>
+        <w:t xml:space="preserve">source-apportionment, health-burden, and citywide-exposure conclusions.</w:t>
       </w:r>
     </w:p>
     <w:p>
@@ -229,65 +307,129 @@
         <w:pStyle w:val="FirstParagraph"/>
       </w:pPr>
       <w:r>
-        <w:t xml:space="preserve">Dhaka’s air pollution is an important public-health and policy concern, but a</w:t>
-      </w:r>
-      <w:r>
-        <w:t xml:space="preserve"> </w:t>
-      </w:r>
-      <w:r>
-        <w:t xml:space="preserve">credible time-series study requires consistent measurement lineage. The legacy</w:t>
-      </w:r>
-      <w:r>
-        <w:t xml:space="preserve"> </w:t>
-      </w:r>
-      <w:r>
-        <w:t xml:space="preserve">repository described a 2017-2025 multi-pollutant monitoring record. Audit of its</w:t>
-      </w:r>
-      <w:r>
-        <w:t xml:space="preserve"> </w:t>
-      </w:r>
-      <w:r>
-        <w:t xml:space="preserve">code and deleted workbooks instead found CAMS reanalysis values, scraped AQI,</w:t>
-      </w:r>
-      <w:r>
-        <w:t xml:space="preserve"> </w:t>
-      </w:r>
-      <w:r>
-        <w:t xml:space="preserve">monthly values repeated across days, unresolved station identities, and annual</w:t>
-      </w:r>
-      <w:r>
-        <w:t xml:space="preserve"> </w:t>
-      </w:r>
-      <w:r>
-        <w:t xml:space="preserve">contextual variables repeated monthly. This revision asks: (1) what seasonal</w:t>
-      </w:r>
-      <w:r>
-        <w:t xml:space="preserve"> </w:t>
-      </w:r>
-      <w:r>
-        <w:t xml:space="preserve">and temporal patterns are supported by one identified ground monitor; (2) how</w:t>
-      </w:r>
-      <w:r>
-        <w:t xml:space="preserve"> </w:t>
-      </w:r>
-      <w:r>
-        <w:t xml:space="preserve">sensitive is trend inference to seasonality and serial dependence; (3) what</w:t>
-      </w:r>
-      <w:r>
-        <w:t xml:space="preserve"> </w:t>
-      </w:r>
-      <w:r>
-        <w:t xml:space="preserve">non-causal association is visible during the 2020 restriction period; and (4)</w:t>
-      </w:r>
-      <w:r>
-        <w:t xml:space="preserve"> </w:t>
-      </w:r>
-      <w:r>
-        <w:t xml:space="preserve">which short-horizon forecast model outperforms seasonal naive in rolling tests?</w:t>
+        <w:t xml:space="preserve">Air pollution is a major environmental-health concern, and WHO guidance covers</w:t>
+      </w:r>
+      <w:r>
+        <w:t xml:space="preserve"> </w:t>
+      </w:r>
+      <w:r>
+        <w:t xml:space="preserve">PM2.5, PM10, NO2, SO2, ozone, and carbon monoxide because their health effects</w:t>
+      </w:r>
+      <w:r>
+        <w:t xml:space="preserve"> </w:t>
+      </w:r>
+      <w:r>
+        <w:t xml:space="preserve">and regulatory averaging periods differ [1]. Prior Dhaka studies using other</w:t>
+      </w:r>
+      <w:r>
+        <w:t xml:space="preserve"> </w:t>
+      </w:r>
+      <w:r>
+        <w:t xml:space="preserve">monitoring periods or research designs have reported strong winter seasonality,</w:t>
+      </w:r>
+      <w:r>
+        <w:t xml:space="preserve"> </w:t>
+      </w:r>
+      <w:r>
+        <w:t xml:space="preserve">high particulate concentrations, and roles for gaseous pollutants [6-10]. Those</w:t>
+      </w:r>
+      <w:r>
+        <w:t xml:space="preserve"> </w:t>
+      </w:r>
+      <w:r>
+        <w:t xml:space="preserve">studies establish the scientific relevance of a multi-pollutant perspective;</w:t>
+      </w:r>
+      <w:r>
+        <w:t xml:space="preserve"> </w:t>
+      </w:r>
+      <w:r>
+        <w:t xml:space="preserve">they do not validate unrelated columns in the present repository.</w:t>
+      </w:r>
+    </w:p>
+    <w:p>
+      <w:pPr>
+        <w:pStyle w:val="BodyText"/>
+      </w:pPr>
+      <w:r>
+        <w:t xml:space="preserve">A credible time-series study requires consistent measurement lineage. The</w:t>
+      </w:r>
+      <w:r>
+        <w:t xml:space="preserve"> </w:t>
+      </w:r>
+      <w:r>
+        <w:t xml:space="preserve">original manuscript described a 2017-2025 multi-pollutant monitoring record,</w:t>
+      </w:r>
+      <w:r>
+        <w:t xml:space="preserve"> </w:t>
+      </w:r>
+      <w:r>
+        <w:t xml:space="preserve">but audit of its code, workbooks, and Git history found CAMS reanalysis values,</w:t>
+      </w:r>
+      <w:r>
+        <w:t xml:space="preserve"> </w:t>
+      </w:r>
+      <w:r>
+        <w:t xml:space="preserve">scraped AQI, monthly values repeated across days, unresolved station identities,</w:t>
+      </w:r>
+      <w:r>
+        <w:t xml:space="preserve"> </w:t>
+      </w:r>
+      <w:r>
+        <w:t xml:space="preserve">and annual contextual variables repeated monthly. The original 41-reference</w:t>
+      </w:r>
+      <w:r>
+        <w:t xml:space="preserve"> </w:t>
+      </w:r>
+      <w:r>
+        <w:t xml:space="preserve">list also contained wrong or unrelated DOIs; its retained sources were checked</w:t>
+      </w:r>
+      <w:r>
+        <w:t xml:space="preserve"> </w:t>
+      </w:r>
+      <w:r>
+        <w:t xml:space="preserve">against publisher, registry, or official metadata.</w:t>
+      </w:r>
+    </w:p>
+    <w:p>
+      <w:pPr>
+        <w:pStyle w:val="BodyText"/>
+      </w:pPr>
+      <w:r>
+        <w:t xml:space="preserve">This revision asks: (1) what seasonal and temporal patterns are supported by</w:t>
+      </w:r>
+      <w:r>
+        <w:t xml:space="preserve"> </w:t>
+      </w:r>
+      <w:r>
+        <w:t xml:space="preserve">one identified ground monitor; (2) how sensitive is trend inference to</w:t>
+      </w:r>
+      <w:r>
+        <w:t xml:space="preserve"> </w:t>
+      </w:r>
+      <w:r>
+        <w:t xml:space="preserve">seasonality and serial dependence; (3) what non-causal association is visible</w:t>
+      </w:r>
+      <w:r>
+        <w:t xml:space="preserve"> </w:t>
+      </w:r>
+      <w:r>
+        <w:t xml:space="preserve">during the 2020 restriction period; and (4) which short-horizon forecast model</w:t>
+      </w:r>
+      <w:r>
+        <w:t xml:space="preserve"> </w:t>
+      </w:r>
+      <w:r>
+        <w:t xml:space="preserve">outperforms seasonal naive in rolling tests? The scope is deliberately narrower</w:t>
+      </w:r>
+      <w:r>
+        <w:t xml:space="preserve"> </w:t>
+      </w:r>
+      <w:r>
+        <w:t xml:space="preserve">than the environmental importance of Dhaka’s full pollutant mixture.</w:t>
       </w:r>
     </w:p>
     <w:bookmarkEnd w:id="10"/>
-    <w:bookmarkStart w:id="15" w:name="data-and-methods"/>
+    <w:bookmarkStart w:id="16" w:name="data-and-methods"/>
     <w:p>
       <w:pPr>
         <w:pStyle w:val="Heading1"/>
@@ -424,13 +566,13 @@
       </w:r>
     </w:p>
     <w:bookmarkEnd w:id="11"/>
-    <w:bookmarkStart w:id="12" w:name="qa-aggregation-and-cutoff"/>
+    <w:bookmarkStart w:id="12" w:name="pollutant-scope-and-aqi-interpretation"/>
     <w:p>
       <w:pPr>
         <w:pStyle w:val="Heading2"/>
       </w:pPr>
       <w:r>
-        <w:t xml:space="preserve">2.2 QA, aggregation, and cutoff</w:t>
+        <w:t xml:space="preserve">2.2 Pollutant scope and AQI interpretation</w:t>
       </w:r>
     </w:p>
     <w:p>
@@ -438,6 +580,292 @@
         <w:pStyle w:val="FirstParagraph"/>
       </w:pPr>
       <w:r>
+        <w:t xml:space="preserve">PM10, NO2, and SO2 were not removed because they are unimportant. A</w:t>
+      </w:r>
+      <w:r>
+        <w:t xml:space="preserve"> </w:t>
+      </w:r>
+      <w:r>
+        <w:t xml:space="preserve">multi-pollutant AQI calculates a subindex from each simultaneous physical</w:t>
+      </w:r>
+      <w:r>
+        <w:t xml:space="preserve"> </w:t>
+      </w:r>
+      <w:r>
+        <w:t xml:space="preserve">concentration and reports the maximum. Any of these pollutants can therefore</w:t>
+      </w:r>
+      <w:r>
+        <w:t xml:space="preserve"> </w:t>
+      </w:r>
+      <w:r>
+        <w:t xml:space="preserve">determine AQI when its subindex is largest. They are parallel inputs to the AQI</w:t>
+      </w:r>
+      <w:r>
+        <w:t xml:space="preserve"> </w:t>
+      </w:r>
+      <w:r>
+        <w:t xml:space="preserve">algorithm, not causal covariates that “influence” an independently measured AQI.</w:t>
+      </w:r>
+    </w:p>
+    <w:tbl>
+      <w:tblPr>
+        <w:tblStyle w:val="Table"/>
+        <w:tblW w:type="pct" w:w="5000"/>
+        <w:tblLayout w:type="fixed"/>
+        <w:tblLook w:firstRow="1" w:lastRow="0" w:firstColumn="0" w:lastColumn="0" w:noHBand="0" w:noVBand="0" w:val="0020"/>
+      </w:tblPr>
+      <w:tblGrid>
+        <w:gridCol w:w="2640"/>
+        <w:gridCol w:w="2640"/>
+        <w:gridCol w:w="2640"/>
+      </w:tblGrid>
+      <w:tr>
+        <w:trPr>
+          <w:tblHeader w:val="on"/>
+        </w:trPr>
+        <w:tc>
+          <w:tcPr/>
+          <w:p>
+            <w:pPr>
+              <w:pStyle w:val="Compact"/>
+            </w:pPr>
+            <w:r>
+              <w:t xml:space="preserve">Pollutant</w:t>
+            </w:r>
+          </w:p>
+        </w:tc>
+        <w:tc>
+          <w:tcPr/>
+          <w:p>
+            <w:pPr>
+              <w:pStyle w:val="Compact"/>
+            </w:pPr>
+            <w:r>
+              <w:t xml:space="preserve">Legacy evidence</w:t>
+            </w:r>
+          </w:p>
+        </w:tc>
+        <w:tc>
+          <w:tcPr/>
+          <w:p>
+            <w:pPr>
+              <w:pStyle w:val="Compact"/>
+            </w:pPr>
+            <w:r>
+              <w:t xml:space="preserve">Revised empirical treatment</w:t>
+            </w:r>
+          </w:p>
+        </w:tc>
+      </w:tr>
+      <w:tr>
+        <w:tc>
+          <w:tcPr/>
+          <w:p>
+            <w:pPr>
+              <w:pStyle w:val="Compact"/>
+            </w:pPr>
+            <w:r>
+              <w:t xml:space="preserve">PM2.5</w:t>
+            </w:r>
+          </w:p>
+        </w:tc>
+        <w:tc>
+          <w:tcPr/>
+          <w:p>
+            <w:pPr>
+              <w:pStyle w:val="Compact"/>
+            </w:pPr>
+            <w:r>
+              <w:t xml:space="preserve">Source-mixed CAMS and monthly values</w:t>
+            </w:r>
+          </w:p>
+        </w:tc>
+        <w:tc>
+          <w:tcPr/>
+          <w:p>
+            <w:pPr>
+              <w:pStyle w:val="Compact"/>
+            </w:pPr>
+            <w:r>
+              <w:t xml:space="preserve">Replaced by identified AirNow/DoS ground-monitor observations</w:t>
+            </w:r>
+          </w:p>
+        </w:tc>
+      </w:tr>
+      <w:tr>
+        <w:tc>
+          <w:tcPr/>
+          <w:p>
+            <w:pPr>
+              <w:pStyle w:val="Compact"/>
+            </w:pPr>
+            <w:r>
+              <w:t xml:space="preserve">PM10</w:t>
+            </w:r>
+          </w:p>
+        </w:tc>
+        <w:tc>
+          <w:tcPr/>
+          <w:p>
+            <w:pPr>
+              <w:pStyle w:val="Compact"/>
+            </w:pPr>
+            <w:r>
+              <w:t xml:space="preserve">Modeled/repeated values; station and method unresolved</w:t>
+            </w:r>
+          </w:p>
+        </w:tc>
+        <w:tc>
+          <w:tcPr/>
+          <w:p>
+            <w:pPr>
+              <w:pStyle w:val="Compact"/>
+            </w:pPr>
+            <w:r>
+              <w:t xml:space="preserve">Excluded pending a homogeneous physical concentration series</w:t>
+            </w:r>
+          </w:p>
+        </w:tc>
+      </w:tr>
+      <w:tr>
+        <w:tc>
+          <w:tcPr/>
+          <w:p>
+            <w:pPr>
+              <w:pStyle w:val="Compact"/>
+            </w:pPr>
+            <w:r>
+              <w:t xml:space="preserve">NO2</w:t>
+            </w:r>
+          </w:p>
+        </w:tc>
+        <w:tc>
+          <w:tcPr/>
+          <w:p>
+            <w:pPr>
+              <w:pStyle w:val="Compact"/>
+            </w:pPr>
+            <w:r>
+              <w:t xml:space="preserve">Modeled/repeated values; units and station unresolved</w:t>
+            </w:r>
+          </w:p>
+        </w:tc>
+        <w:tc>
+          <w:tcPr/>
+          <w:p>
+            <w:pPr>
+              <w:pStyle w:val="Compact"/>
+            </w:pPr>
+            <w:r>
+              <w:t xml:space="preserve">Excluded pending a homogeneous physical concentration series</w:t>
+            </w:r>
+          </w:p>
+        </w:tc>
+      </w:tr>
+      <w:tr>
+        <w:tc>
+          <w:tcPr/>
+          <w:p>
+            <w:pPr>
+              <w:pStyle w:val="Compact"/>
+            </w:pPr>
+            <w:r>
+              <w:t xml:space="preserve">SO2</w:t>
+            </w:r>
+          </w:p>
+        </w:tc>
+        <w:tc>
+          <w:tcPr/>
+          <w:p>
+            <w:pPr>
+              <w:pStyle w:val="Compact"/>
+            </w:pPr>
+            <w:r>
+              <w:t xml:space="preserve">Modeled/repeated values; units and station unresolved</w:t>
+            </w:r>
+          </w:p>
+        </w:tc>
+        <w:tc>
+          <w:tcPr/>
+          <w:p>
+            <w:pPr>
+              <w:pStyle w:val="Compact"/>
+            </w:pPr>
+            <w:r>
+              <w:t xml:space="preserve">Excluded pending a homogeneous physical concentration series</w:t>
+            </w:r>
+          </w:p>
+        </w:tc>
+      </w:tr>
+    </w:tbl>
+    <w:p>
+      <w:pPr>
+        <w:pStyle w:val="BodyText"/>
+      </w:pPr>
+      <w:r>
+        <w:t xml:space="preserve">Because PM2.5 is the only verified simultaneous concentration, the recalculated</w:t>
+      </w:r>
+      <w:r>
+        <w:t xml:space="preserve"> </w:t>
+      </w:r>
+      <w:r>
+        <w:t xml:space="preserve">AQI in this study is specifically the PM2.5 subindex. The stored</w:t>
+      </w:r>
+      <w:r>
+        <w:t xml:space="preserve"> </w:t>
+      </w:r>
+      <w:r>
+        <w:rPr>
+          <w:rStyle w:val="VerbatimChar"/>
+        </w:rPr>
+        <w:t xml:space="preserve">dominant_pollutant=pm25</w:t>
+      </w:r>
+      <w:r>
+        <w:t xml:space="preserve"> </w:t>
+      </w:r>
+      <w:r>
+        <w:t xml:space="preserve">value means PM2.5 is the only available calculated</w:t>
+      </w:r>
+      <w:r>
+        <w:t xml:space="preserve"> </w:t>
+      </w:r>
+      <w:r>
+        <w:t xml:space="preserve">subindex; it does not prove that PM2.5 dominated Dhaka’s complete</w:t>
+      </w:r>
+      <w:r>
+        <w:t xml:space="preserve"> </w:t>
+      </w:r>
+      <w:r>
+        <w:t xml:space="preserve">multi-pollutant AQI on every day. Prior Dhaka studies confirm that PM10 and</w:t>
+      </w:r>
+      <w:r>
+        <w:t xml:space="preserve"> </w:t>
+      </w:r>
+      <w:r>
+        <w:t xml:space="preserve">gaseous pollutants warrant monitoring [6,7], but their results cannot be</w:t>
+      </w:r>
+      <w:r>
+        <w:t xml:space="preserve"> </w:t>
+      </w:r>
+      <w:r>
+        <w:t xml:space="preserve">silently spliced into this station series.</w:t>
+      </w:r>
+    </w:p>
+    <w:bookmarkEnd w:id="12"/>
+    <w:bookmarkStart w:id="13" w:name="qa-aggregation-and-cutoff"/>
+    <w:p>
+      <w:pPr>
+        <w:pStyle w:val="Heading2"/>
+      </w:pPr>
+      <w:r>
+        <w:t xml:space="preserve">2.3 QA, aggregation, and cutoff</w:t>
+      </w:r>
+    </w:p>
+    <w:p>
+      <w:pPr>
+        <w:pStyle w:val="FirstParagraph"/>
+      </w:pPr>
+      <w:r>
         <w:t xml:space="preserve">The pipeline rejected wrong station, agency, pollutant, unit, duration,</w:t>
       </w:r>
       <w:r>
@@ -497,14 +925,14 @@
         <w:t xml:space="preserve">not an independent environmental outcome.</w:t>
       </w:r>
     </w:p>
-    <w:bookmarkEnd w:id="12"/>
-    <w:bookmarkStart w:id="13" w:name="statistical-analysis"/>
+    <w:bookmarkEnd w:id="13"/>
+    <w:bookmarkStart w:id="14" w:name="statistical-analysis"/>
     <w:p>
       <w:pPr>
         <w:pStyle w:val="Heading2"/>
       </w:pPr>
       <w:r>
-        <w:t xml:space="preserve">2.3 Statistical analysis</w:t>
+        <w:t xml:space="preserve">2.4 Statistical analysis</w:t>
       </w:r>
     </w:p>
     <w:p>
@@ -585,14 +1013,14 @@
         <w:t xml:space="preserve">guidelines, and daily observations with the specified 24-hour forms.</w:t>
       </w:r>
     </w:p>
-    <w:bookmarkEnd w:id="13"/>
-    <w:bookmarkStart w:id="14" w:name="forecasting-and-scenarios"/>
+    <w:bookmarkEnd w:id="14"/>
+    <w:bookmarkStart w:id="15" w:name="forecasting-and-scenarios"/>
     <w:p>
       <w:pPr>
         <w:pStyle w:val="Heading2"/>
       </w:pPr>
       <w:r>
-        <w:t xml:space="preserve">2.4 Forecasting and scenarios</w:t>
+        <w:t xml:space="preserve">2.5 Forecasting and scenarios</w:t>
       </w:r>
     </w:p>
     <w:p>
@@ -633,9 +1061,9 @@
         <w:t xml:space="preserve">forecasts; no probabilistic interval is fabricated for policy implementation.</w:t>
       </w:r>
     </w:p>
-    <w:bookmarkEnd w:id="14"/>
     <w:bookmarkEnd w:id="15"/>
-    <w:bookmarkStart w:id="40" w:name="results"/>
+    <w:bookmarkEnd w:id="16"/>
+    <w:bookmarkStart w:id="41" w:name="results"/>
     <w:p>
       <w:pPr>
         <w:pStyle w:val="Heading1"/>
@@ -644,7 +1072,7 @@
         <w:t xml:space="preserve">3. Results</w:t>
       </w:r>
     </w:p>
-    <w:bookmarkStart w:id="19" w:name="completeness-and-distribution"/>
+    <w:bookmarkStart w:id="20" w:name="completeness-and-distribution"/>
     <w:p>
       <w:pPr>
         <w:pStyle w:val="Heading2"/>
@@ -694,18 +1122,18 @@
           <wp:inline>
             <wp:extent cx="4800600" cy="2433103"/>
             <wp:effectExtent b="0" l="0" r="0" t="0"/>
-            <wp:docPr descr="Observed monthly PM2.5. Open symbols are excluded partial months. Source: U.S. Department of State via AirNow." title="" id="17" name="Picture"/>
+            <wp:docPr descr="Observed monthly PM2.5. Open symbols are excluded partial months. Source: U.S. Department of State via AirNow." title="" id="18" name="Picture"/>
             <a:graphic>
               <a:graphicData uri="http://schemas.openxmlformats.org/drawingml/2006/picture">
                 <pic:pic>
                   <pic:nvPicPr>
-                    <pic:cNvPr descr="figures/observed_pm25_time_series.png" id="18" name="Picture"/>
+                    <pic:cNvPr descr="figures/observed_pm25_time_series.png" id="19" name="Picture"/>
                     <pic:cNvPicPr>
                       <a:picLocks noChangeArrowheads="1" noChangeAspect="1"/>
                     </pic:cNvPicPr>
                   </pic:nvPicPr>
                   <pic:blipFill>
-                    <a:blip r:embed="rId16"/>
+                    <a:blip r:embed="rId17"/>
                     <a:stretch>
                       <a:fillRect/>
                     </a:stretch>
@@ -740,8 +1168,8 @@
         <w:t xml:space="preserve">Observed monthly PM2.5. Open symbols are excluded partial months. Source: U.S. Department of State via AirNow.</w:t>
       </w:r>
     </w:p>
-    <w:bookmarkEnd w:id="19"/>
-    <w:bookmarkStart w:id="23" w:name="seasonality"/>
+    <w:bookmarkEnd w:id="20"/>
+    <w:bookmarkStart w:id="24" w:name="seasonality"/>
     <w:p>
       <w:pPr>
         <w:pStyle w:val="Heading2"/>
@@ -785,18 +1213,18 @@
           <wp:inline>
             <wp:extent cx="4267200" cy="2642569"/>
             <wp:effectExtent b="0" l="0" r="0" t="0"/>
-            <wp:docPr descr="Monthly climatology with 95% confidence intervals; complete months only." title="" id="21" name="Picture"/>
+            <wp:docPr descr="Monthly climatology with 95% confidence intervals; complete months only." title="" id="22" name="Picture"/>
             <a:graphic>
               <a:graphicData uri="http://schemas.openxmlformats.org/drawingml/2006/picture">
                 <pic:pic>
                   <pic:nvPicPr>
-                    <pic:cNvPr descr="figures/monthly_climatology.png" id="22" name="Picture"/>
+                    <pic:cNvPr descr="figures/monthly_climatology.png" id="23" name="Picture"/>
                     <pic:cNvPicPr>
                       <a:picLocks noChangeArrowheads="1" noChangeAspect="1"/>
                     </pic:cNvPicPr>
                   </pic:nvPicPr>
                   <pic:blipFill>
-                    <a:blip r:embed="rId20"/>
+                    <a:blip r:embed="rId21"/>
                     <a:stretch>
                       <a:fillRect/>
                     </a:stretch>
@@ -831,8 +1259,8 @@
         <w:t xml:space="preserve">Monthly climatology with 95% confidence intervals; complete months only.</w:t>
       </w:r>
     </w:p>
-    <w:bookmarkEnd w:id="23"/>
-    <w:bookmarkStart w:id="24" w:name="trends-and-break-diagnostic"/>
+    <w:bookmarkEnd w:id="24"/>
+    <w:bookmarkStart w:id="25" w:name="trends-and-break-diagnostic"/>
     <w:p>
       <w:pPr>
         <w:pStyle w:val="Heading2"/>
@@ -897,8 +1325,8 @@
         <w:t xml:space="preserve">(p=0.48).</w:t>
       </w:r>
     </w:p>
-    <w:bookmarkEnd w:id="24"/>
-    <w:bookmarkStart w:id="25" w:name="restriction-period-association"/>
+    <w:bookmarkEnd w:id="25"/>
+    <w:bookmarkStart w:id="26" w:name="restriction-period-association"/>
     <w:p>
       <w:pPr>
         <w:pStyle w:val="Heading2"/>
@@ -939,8 +1367,8 @@
         <w:t xml:space="preserve">of meteorological adjustment preclude a causal conclusion.</w:t>
       </w:r>
     </w:p>
-    <w:bookmarkEnd w:id="25"/>
-    <w:bookmarkStart w:id="29" w:name="guideline-comparisons"/>
+    <w:bookmarkEnd w:id="26"/>
+    <w:bookmarkStart w:id="30" w:name="guideline-comparisons"/>
     <w:p>
       <w:pPr>
         <w:pStyle w:val="Heading2"/>
@@ -1244,18 +1672,18 @@
           <wp:inline>
             <wp:extent cx="4267200" cy="2642569"/>
             <wp:effectExtent b="0" l="0" r="0" t="0"/>
-            <wp:docPr descr="Annual monitor means with annual reference levels; these are not interchangeable with 24-hour standards." title="" id="27" name="Picture"/>
+            <wp:docPr descr="Annual monitor means with annual reference levels; these are not interchangeable with 24-hour standards." title="" id="28" name="Picture"/>
             <a:graphic>
               <a:graphicData uri="http://schemas.openxmlformats.org/drawingml/2006/picture">
                 <pic:pic>
                   <pic:nvPicPr>
-                    <pic:cNvPr descr="figures/annual_guideline_comparison.png" id="28" name="Picture"/>
+                    <pic:cNvPr descr="figures/annual_guideline_comparison.png" id="29" name="Picture"/>
                     <pic:cNvPicPr>
                       <a:picLocks noChangeArrowheads="1" noChangeAspect="1"/>
                     </pic:cNvPicPr>
                   </pic:nvPicPr>
                   <pic:blipFill>
-                    <a:blip r:embed="rId26"/>
+                    <a:blip r:embed="rId27"/>
                     <a:stretch>
                       <a:fillRect/>
                     </a:stretch>
@@ -1290,8 +1718,8 @@
         <w:t xml:space="preserve">Annual monitor means with annual reference levels; these are not interchangeable with 24-hour standards.</w:t>
       </w:r>
     </w:p>
-    <w:bookmarkEnd w:id="29"/>
-    <w:bookmarkStart w:id="39" w:name="forecast-validation"/>
+    <w:bookmarkEnd w:id="30"/>
+    <w:bookmarkStart w:id="40" w:name="forecast-validation"/>
     <w:p>
       <w:pPr>
         <w:pStyle w:val="Heading2"/>
@@ -1335,18 +1763,18 @@
           <wp:inline>
             <wp:extent cx="4267200" cy="2919880"/>
             <wp:effectExtent b="0" l="0" r="0" t="0"/>
-            <wp:docPr descr="Rolling-origin 12-month backtesting." title="" id="31" name="Picture"/>
+            <wp:docPr descr="Rolling-origin 12-month backtesting." title="" id="32" name="Picture"/>
             <a:graphic>
               <a:graphicData uri="http://schemas.openxmlformats.org/drawingml/2006/picture">
                 <pic:pic>
                   <pic:nvPicPr>
-                    <pic:cNvPr descr="figures/forecast_backtesting.png" id="32" name="Picture"/>
+                    <pic:cNvPr descr="figures/forecast_backtesting.png" id="33" name="Picture"/>
                     <pic:cNvPicPr>
                       <a:picLocks noChangeArrowheads="1" noChangeAspect="1"/>
                     </pic:cNvPicPr>
                   </pic:nvPicPr>
                   <pic:blipFill>
-                    <a:blip r:embed="rId30"/>
+                    <a:blip r:embed="rId31"/>
                     <a:stretch>
                       <a:fillRect/>
                     </a:stretch>
@@ -1390,18 +1818,18 @@
           <wp:inline>
             <wp:extent cx="4800600" cy="2459346"/>
             <wp:effectExtent b="0" l="0" r="0" t="0"/>
-            <wp:docPr descr="Selected 24-month forecast with 95% prediction intervals." title="" id="34" name="Picture"/>
+            <wp:docPr descr="Selected 24-month forecast with 95% prediction intervals." title="" id="35" name="Picture"/>
             <a:graphic>
               <a:graphicData uri="http://schemas.openxmlformats.org/drawingml/2006/picture">
                 <pic:pic>
                   <pic:nvPicPr>
-                    <pic:cNvPr descr="figures/forecast_intervals.png" id="35" name="Picture"/>
+                    <pic:cNvPr descr="figures/forecast_intervals.png" id="36" name="Picture"/>
                     <pic:cNvPicPr>
                       <a:picLocks noChangeArrowheads="1" noChangeAspect="1"/>
                     </pic:cNvPicPr>
                   </pic:nvPicPr>
                   <pic:blipFill>
-                    <a:blip r:embed="rId33"/>
+                    <a:blip r:embed="rId34"/>
                     <a:stretch>
                       <a:fillRect/>
                     </a:stretch>
@@ -1465,18 +1893,18 @@
           <wp:inline>
             <wp:extent cx="4267200" cy="2642569"/>
             <wp:effectExtent b="0" l="0" r="0" t="0"/>
-            <wp:docPr descr="Conditional 2030 benchmark paths, not forecasts." title="" id="37" name="Picture"/>
+            <wp:docPr descr="Conditional 2030 benchmark paths, not forecasts." title="" id="38" name="Picture"/>
             <a:graphic>
               <a:graphicData uri="http://schemas.openxmlformats.org/drawingml/2006/picture">
                 <pic:pic>
                   <pic:nvPicPr>
-                    <pic:cNvPr descr="figures/scenarios_2030.png" id="38" name="Picture"/>
+                    <pic:cNvPr descr="figures/scenarios_2030.png" id="39" name="Picture"/>
                     <pic:cNvPicPr>
                       <a:picLocks noChangeArrowheads="1" noChangeAspect="1"/>
                     </pic:cNvPicPr>
                   </pic:nvPicPr>
                   <pic:blipFill>
-                    <a:blip r:embed="rId36"/>
+                    <a:blip r:embed="rId37"/>
                     <a:stretch>
                       <a:fillRect/>
                     </a:stretch>
@@ -1511,9 +1939,9 @@
         <w:t xml:space="preserve">Conditional 2030 benchmark paths, not forecasts.</w:t>
       </w:r>
     </w:p>
-    <w:bookmarkEnd w:id="39"/>
     <w:bookmarkEnd w:id="40"/>
-    <w:bookmarkStart w:id="41" w:name="discussion"/>
+    <w:bookmarkEnd w:id="41"/>
+    <w:bookmarkStart w:id="45" w:name="discussion"/>
     <w:p>
       <w:pPr>
         <w:pStyle w:val="Heading1"/>
@@ -1522,6 +1950,15 @@
         <w:t xml:space="preserve">4. Discussion</w:t>
       </w:r>
     </w:p>
+    <w:bookmarkStart w:id="42" w:name="what-changed-after-the-provenance-audit"/>
+    <w:p>
+      <w:pPr>
+        <w:pStyle w:val="Heading2"/>
+      </w:pPr>
+      <w:r>
+        <w:t xml:space="preserve">4.1 What changed after the provenance audit</w:t>
+      </w:r>
+    </w:p>
     <w:p>
       <w:pPr>
         <w:pStyle w:val="FirstParagraph"/>
@@ -1554,42 +1991,150 @@
         <w:t xml:space="preserve">The correct conclusion is sensitivity, not a definitive monotonic trajectory.</w:t>
       </w:r>
     </w:p>
+    <w:bookmarkEnd w:id="42"/>
+    <w:bookmarkStart w:id="43" w:name="why-pm10-no2-and-so2-still-matter"/>
+    <w:p>
+      <w:pPr>
+        <w:pStyle w:val="Heading2"/>
+      </w:pPr>
+      <w:r>
+        <w:t xml:space="preserve">4.2 Why PM10, NO2, and SO2 still matter</w:t>
+      </w:r>
+    </w:p>
+    <w:p>
+      <w:pPr>
+        <w:pStyle w:val="FirstParagraph"/>
+      </w:pPr>
+      <w:r>
+        <w:t xml:space="preserve">The original paper was correct that PM10, NO2, and SO2 are environmentally and</w:t>
+      </w:r>
+      <w:r>
+        <w:t xml:space="preserve"> </w:t>
+      </w:r>
+      <w:r>
+        <w:t xml:space="preserve">regulatorily important. Historical multi-site work in Dhaka measured PM10 and</w:t>
+      </w:r>
+      <w:r>
+        <w:t xml:space="preserve"> </w:t>
+      </w:r>
+      <w:r>
+        <w:t xml:space="preserve">gaseous pollutants alongside PM2.5 and found pollutant-specific seasonal and</w:t>
+      </w:r>
+      <w:r>
+        <w:t xml:space="preserve"> </w:t>
+      </w:r>
+      <w:r>
+        <w:t xml:space="preserve">trend behavior [6,7]. Their absence from the revised numerical tables is an</w:t>
+      </w:r>
+      <w:r>
+        <w:t xml:space="preserve"> </w:t>
+      </w:r>
+      <w:r>
+        <w:t xml:space="preserve">evidence boundary: the repository does not contain a homogeneous, traceable</w:t>
+      </w:r>
+      <w:r>
+        <w:t xml:space="preserve"> </w:t>
+      </w:r>
+      <w:r>
+        <w:t xml:space="preserve">series for them. Treating modeled CAMS values, repeated monthly values, and</w:t>
+      </w:r>
+      <w:r>
+        <w:t xml:space="preserve"> </w:t>
+      </w:r>
+      <w:r>
+        <w:t xml:space="preserve">unresolved ground records as one series would produce precise-looking but</w:t>
+      </w:r>
+      <w:r>
+        <w:t xml:space="preserve"> </w:t>
+      </w:r>
+      <w:r>
+        <w:t xml:space="preserve">invalid pollutant rankings and forecasts.</w:t>
+      </w:r>
+    </w:p>
     <w:p>
       <w:pPr>
         <w:pStyle w:val="BodyText"/>
       </w:pPr>
       <w:r>
+        <w:t xml:space="preserve">This distinction also changes AQI interpretation. If simultaneous PM10, NO2,</w:t>
+      </w:r>
+      <w:r>
+        <w:t xml:space="preserve"> </w:t>
+      </w:r>
+      <w:r>
+        <w:t xml:space="preserve">SO2, CO, and O3 concentrations become available, every applicable subindex</w:t>
+      </w:r>
+      <w:r>
+        <w:t xml:space="preserve"> </w:t>
+      </w:r>
+      <w:r>
+        <w:t xml:space="preserve">should be calculated under one declared standard and the daily maximum should</w:t>
+      </w:r>
+      <w:r>
+        <w:t xml:space="preserve"> </w:t>
+      </w:r>
+      <w:r>
+        <w:t xml:space="preserve">be retained. Until then, the present calculated AQI is a PM2.5 subindex, and no</w:t>
+      </w:r>
+      <w:r>
+        <w:t xml:space="preserve"> </w:t>
+      </w:r>
+      <w:r>
+        <w:t xml:space="preserve">claim is made about the historical percentage of days dominated by other</w:t>
+      </w:r>
+      <w:r>
+        <w:t xml:space="preserve"> </w:t>
+      </w:r>
+      <w:r>
+        <w:t xml:space="preserve">pollutants.</w:t>
+      </w:r>
+    </w:p>
+    <w:bookmarkEnd w:id="43"/>
+    <w:bookmarkStart w:id="44" w:name="X82a6ce7334f2bc235507f55b2629fd80320b3a3"/>
+    <w:p>
+      <w:pPr>
+        <w:pStyle w:val="Heading2"/>
+      </w:pPr>
+      <w:r>
+        <w:t xml:space="preserve">4.3 Seasonality, sources, COVID, and forecasting</w:t>
+      </w:r>
+    </w:p>
+    <w:p>
+      <w:pPr>
+        <w:pStyle w:val="FirstParagraph"/>
+      </w:pPr>
+      <w:r>
         <w:t xml:space="preserve">Seasonality is much more stable: winter concentrations are high and monsoon</w:t>
       </w:r>
       <w:r>
         <w:t xml:space="preserve"> </w:t>
       </w:r>
       <w:r>
-        <w:t xml:space="preserve">concentrations low. This pattern is consistent with meteorological dispersion,</w:t>
-      </w:r>
-      <w:r>
-        <w:t xml:space="preserve"> </w:t>
-      </w:r>
-      <w:r>
-        <w:t xml:space="preserve">wet removal, seasonal emissions, and regional transport, but the present data</w:t>
-      </w:r>
-      <w:r>
-        <w:t xml:space="preserve"> </w:t>
-      </w:r>
-      <w:r>
-        <w:t xml:space="preserve">do not apportion sources. PM2.5 cannot be summed with PM10 for source</w:t>
-      </w:r>
-      <w:r>
-        <w:t xml:space="preserve"> </w:t>
-      </w:r>
-      <w:r>
-        <w:t xml:space="preserve">apportionment, and no chemical speciation, PMF/CMB, inventory, or transport</w:t>
-      </w:r>
-      <w:r>
-        <w:t xml:space="preserve"> </w:t>
-      </w:r>
-      <w:r>
-        <w:t xml:space="preserve">attribution is implemented.</w:t>
+        <w:t xml:space="preserve">concentrations low, consistent with earlier Dhaka research [6-10]. Published</w:t>
+      </w:r>
+      <w:r>
+        <w:t xml:space="preserve"> </w:t>
+      </w:r>
+      <w:r>
+        <w:t xml:space="preserve">black-carbon and isotope studies support roles for local and regional combustion</w:t>
+      </w:r>
+      <w:r>
+        <w:t xml:space="preserve"> </w:t>
+      </w:r>
+      <w:r>
+        <w:t xml:space="preserve">sources [9,10], but the present data do not apportion sources. PM2.5 cannot be</w:t>
+      </w:r>
+      <w:r>
+        <w:t xml:space="preserve"> </w:t>
+      </w:r>
+      <w:r>
+        <w:t xml:space="preserve">summed with PM10 for source apportionment, and no chemical speciation, PMF/CMB,</w:t>
+      </w:r>
+      <w:r>
+        <w:t xml:space="preserve"> </w:t>
+      </w:r>
+      <w:r>
+        <w:t xml:space="preserve">inventory, or transport attribution is implemented here.</w:t>
       </w:r>
     </w:p>
     <w:p>
@@ -1617,9 +2162,34 @@
       <w:r>
         <w:t xml:space="preserve">AQI-PM2.5 correlation would be definitional and is not presented as discovery.</w:t>
       </w:r>
-    </w:p>
-    <w:bookmarkEnd w:id="41"/>
-    <w:bookmarkStart w:id="42" w:name="limitations"/>
+      <w:r>
+        <w:t xml:space="preserve"> </w:t>
+      </w:r>
+      <w:r>
+        <w:t xml:space="preserve">The selected 24-month forecast is an empirical extrapolation, whereas the 2030</w:t>
+      </w:r>
+      <w:r>
+        <w:t xml:space="preserve"> </w:t>
+      </w:r>
+      <w:r>
+        <w:t xml:space="preserve">lines are policy/health benchmarks; Bangladesh’s national air-quality plan</w:t>
+      </w:r>
+      <w:r>
+        <w:t xml:space="preserve"> </w:t>
+      </w:r>
+      <w:r>
+        <w:t xml:space="preserve">provides relevant policy context but does not make those benchmark paths</w:t>
+      </w:r>
+      <w:r>
+        <w:t xml:space="preserve"> </w:t>
+      </w:r>
+      <w:r>
+        <w:t xml:space="preserve">probabilistic forecasts [11].</w:t>
+      </w:r>
+    </w:p>
+    <w:bookmarkEnd w:id="44"/>
+    <w:bookmarkEnd w:id="45"/>
+    <w:bookmarkStart w:id="46" w:name="limitations"/>
     <w:p>
       <w:pPr>
         <w:pStyle w:val="Heading1"/>
@@ -1663,35 +2233,47 @@
         <w:t xml:space="preserve"> </w:t>
       </w:r>
       <w:r>
-        <w:t xml:space="preserve">series was available. The feed cessation limits the empirical period. Forecast</w:t>
-      </w:r>
-      <w:r>
-        <w:t xml:space="preserve"> </w:t>
-      </w:r>
-      <w:r>
-        <w:t xml:space="preserve">validation has only three annual rolling origins, and the 24-month outlook</w:t>
-      </w:r>
-      <w:r>
-        <w:t xml:space="preserve"> </w:t>
-      </w:r>
-      <w:r>
-        <w:t xml:space="preserve">cannot establish 2030 conditions. Trend conclusions depend on serial-correlation</w:t>
-      </w:r>
-      <w:r>
-        <w:t xml:space="preserve"> </w:t>
-      </w:r>
-      <w:r>
-        <w:t xml:space="preserve">handling. The missing original manuscript also prevents a line-by-line reference</w:t>
-      </w:r>
-      <w:r>
-        <w:t xml:space="preserve"> </w:t>
-      </w:r>
-      <w:r>
-        <w:t xml:space="preserve">audit and genuine tracked changes.</w:t>
-      </w:r>
-    </w:p>
-    <w:bookmarkEnd w:id="42"/>
-    <w:bookmarkStart w:id="43" w:name="conclusion"/>
+        <w:t xml:space="preserve">series was available. The absence of traceable PM10, NO2, SO2, CO, and O3</w:t>
+      </w:r>
+      <w:r>
+        <w:t xml:space="preserve"> </w:t>
+      </w:r>
+      <w:r>
+        <w:t xml:space="preserve">prevents calculation of a complete multi-pollutant AQI and pollutant-dominance</w:t>
+      </w:r>
+      <w:r>
+        <w:t xml:space="preserve"> </w:t>
+      </w:r>
+      <w:r>
+        <w:t xml:space="preserve">fractions. The feed cessation limits the empirical period. Forecast validation</w:t>
+      </w:r>
+      <w:r>
+        <w:t xml:space="preserve"> </w:t>
+      </w:r>
+      <w:r>
+        <w:t xml:space="preserve">has only three annual rolling origins, and the 24-month outlook cannot establish</w:t>
+      </w:r>
+      <w:r>
+        <w:t xml:space="preserve"> </w:t>
+      </w:r>
+      <w:r>
+        <w:t xml:space="preserve">2030 conditions. Trend conclusions depend on serial-correlation handling. The</w:t>
+      </w:r>
+      <w:r>
+        <w:t xml:space="preserve"> </w:t>
+      </w:r>
+      <w:r>
+        <w:t xml:space="preserve">supplied original contained no tracked-change history; this is therefore a</w:t>
+      </w:r>
+      <w:r>
+        <w:t xml:space="preserve"> </w:t>
+      </w:r>
+      <w:r>
+        <w:t xml:space="preserve">clean revision accompanied by claim and reference audits.</w:t>
+      </w:r>
+    </w:p>
+    <w:bookmarkEnd w:id="46"/>
+    <w:bookmarkStart w:id="47" w:name="conclusion"/>
     <w:p>
       <w:pPr>
         <w:pStyle w:val="Heading1"/>
@@ -1741,11 +2323,23 @@
         <w:t xml:space="preserve"> </w:t>
       </w:r>
       <w:r>
-        <w:t xml:space="preserve">benchmarks.</w:t>
-      </w:r>
-    </w:p>
-    <w:bookmarkEnd w:id="43"/>
-    <w:bookmarkStart w:id="44" w:name="data-and-code-availability"/>
+        <w:t xml:space="preserve">benchmarks. PM10, NO2, and SO2 remain essential monitoring targets and potential</w:t>
+      </w:r>
+      <w:r>
+        <w:t xml:space="preserve"> </w:t>
+      </w:r>
+      <w:r>
+        <w:t xml:space="preserve">AQI-determining pollutants; defensible analysis of them requires a new,</w:t>
+      </w:r>
+      <w:r>
+        <w:t xml:space="preserve"> </w:t>
+      </w:r>
+      <w:r>
+        <w:t xml:space="preserve">station-identified, unit-verified, QA-documented concentration series.</w:t>
+      </w:r>
+    </w:p>
+    <w:bookmarkEnd w:id="47"/>
+    <w:bookmarkStart w:id="48" w:name="data-and-code-availability"/>
     <w:p>
       <w:pPr>
         <w:pStyle w:val="Heading1"/>
@@ -1792,7 +2386,7 @@
         <w:rPr>
           <w:rStyle w:val="VerbatimChar"/>
         </w:rPr>
-        <w:t xml:space="preserve">7d8d48e66bfe2d7acb291dd48614957dcd28f963</w:t>
+        <w:t xml:space="preserve">a23c18f84355f8d87cc17e81d9542b7fc9879e7f</w:t>
       </w:r>
       <w:r>
         <w:t xml:space="preserve">. Raw retrieval occurred on</w:t>
@@ -1801,11 +2395,23 @@
         <w:t xml:space="preserve"> </w:t>
       </w:r>
       <w:r>
-        <w:t xml:space="preserve">2026-07-18 UTC (2026-07-17 America/New_York).</w:t>
-      </w:r>
-    </w:p>
-    <w:bookmarkEnd w:id="44"/>
-    <w:bookmarkStart w:id="45" w:name="references"/>
+        <w:t xml:space="preserve">2026-07-18 UTC (2026-07-17 America/New_York). The supplied original DOCX is</w:t>
+      </w:r>
+      <w:r>
+        <w:t xml:space="preserve"> </w:t>
+      </w:r>
+      <w:r>
+        <w:t xml:space="preserve">preserved unchanged with a SHA-256 manifest; its complete claim and 41-reference</w:t>
+      </w:r>
+      <w:r>
+        <w:t xml:space="preserve"> </w:t>
+      </w:r>
+      <w:r>
+        <w:t xml:space="preserve">audits are distributed with the revision.</w:t>
+      </w:r>
+    </w:p>
+    <w:bookmarkEnd w:id="48"/>
+    <w:bookmarkStart w:id="49" w:name="references"/>
     <w:p>
       <w:pPr>
         <w:pStyle w:val="Heading1"/>
@@ -1939,7 +2545,157 @@
         <w:t xml:space="preserve">. Effective 6 May 2024. https://www.epa.gov/pm-pollution/final-reconsideration-national-ambient-air-quality-standards-particulate-matter-pm</w:t>
       </w:r>
     </w:p>
-    <w:bookmarkEnd w:id="45"/>
+    <w:p>
+      <w:pPr>
+        <w:pStyle w:val="Compact"/>
+        <w:numPr>
+          <w:ilvl w:val="0"/>
+          <w:numId w:val="1001"/>
+        </w:numPr>
+      </w:pPr>
+      <w:r>
+        <w:t xml:space="preserve">Rahman MM, Mahamud S, Thurston GD. Recent spatial gradients and time trends in Dhaka, Bangladesh, air pollution and their human health implications.</w:t>
+      </w:r>
+      <w:r>
+        <w:t xml:space="preserve"> </w:t>
+      </w:r>
+      <w:r>
+        <w:rPr>
+          <w:i/>
+          <w:iCs/>
+        </w:rPr>
+        <w:t xml:space="preserve">Journal of the Air &amp; Waste Management Association</w:t>
+      </w:r>
+      <w:r>
+        <w:t xml:space="preserve">. 2019;69(4):478-501. https://doi.org/10.1080/10962247.2018.1548388</w:t>
+      </w:r>
+    </w:p>
+    <w:p>
+      <w:pPr>
+        <w:pStyle w:val="Compact"/>
+        <w:numPr>
+          <w:ilvl w:val="0"/>
+          <w:numId w:val="1001"/>
+        </w:numPr>
+      </w:pPr>
+      <w:r>
+        <w:t xml:space="preserve">Pavel MRS, Zaman SU, Jeba F, Islam MS, Salam A. Long-Term (2003-2019) Air Quality, Climate Variables, and Human Health Consequences in Dhaka, Bangladesh.</w:t>
+      </w:r>
+      <w:r>
+        <w:t xml:space="preserve"> </w:t>
+      </w:r>
+      <w:r>
+        <w:rPr>
+          <w:i/>
+          <w:iCs/>
+        </w:rPr>
+        <w:t xml:space="preserve">Frontiers in Sustainable Cities</w:t>
+      </w:r>
+      <w:r>
+        <w:t xml:space="preserve">. 2021;3:681759. https://doi.org/10.3389/frsc.2021.681759</w:t>
+      </w:r>
+    </w:p>
+    <w:p>
+      <w:pPr>
+        <w:pStyle w:val="Compact"/>
+        <w:numPr>
+          <w:ilvl w:val="0"/>
+          <w:numId w:val="1001"/>
+        </w:numPr>
+      </w:pPr>
+      <w:r>
+        <w:t xml:space="preserve">Rahman R-R, Kabir A. Spatiotemporal analysis and forecasting of air quality in the greater Dhaka region and assessment of a novel particulate matter filtration unit.</w:t>
+      </w:r>
+      <w:r>
+        <w:t xml:space="preserve"> </w:t>
+      </w:r>
+      <w:r>
+        <w:rPr>
+          <w:i/>
+          <w:iCs/>
+        </w:rPr>
+        <w:t xml:space="preserve">Environmental Monitoring and Assessment</w:t>
+      </w:r>
+      <w:r>
+        <w:t xml:space="preserve">. 2023;195:824. https://doi.org/10.1007/s10661-023-11370-y</w:t>
+      </w:r>
+    </w:p>
+    <w:p>
+      <w:pPr>
+        <w:pStyle w:val="Compact"/>
+        <w:numPr>
+          <w:ilvl w:val="0"/>
+          <w:numId w:val="1001"/>
+        </w:numPr>
+      </w:pPr>
+      <w:r>
+        <w:t xml:space="preserve">Salam A, Andersson A, Jeba F, Haque MI, Khan MDH, Gustafsson O. Wintertime Air Quality in Megacity Dhaka, Bangladesh Strongly Affected by Influx of Black Carbon Aerosols from Regional Biomass Burning.</w:t>
+      </w:r>
+      <w:r>
+        <w:t xml:space="preserve"> </w:t>
+      </w:r>
+      <w:r>
+        <w:rPr>
+          <w:i/>
+          <w:iCs/>
+        </w:rPr>
+        <w:t xml:space="preserve">Environmental Science &amp; Technology</w:t>
+      </w:r>
+      <w:r>
+        <w:t xml:space="preserve">. 2021;55(18):12243-12249. https://doi.org/10.1021/acs.est.1c03623</w:t>
+      </w:r>
+    </w:p>
+    <w:p>
+      <w:pPr>
+        <w:pStyle w:val="Compact"/>
+        <w:numPr>
+          <w:ilvl w:val="0"/>
+          <w:numId w:val="1001"/>
+        </w:numPr>
+      </w:pPr>
+      <w:r>
+        <w:t xml:space="preserve">Nayem AKM, Zaman SU, Begum F, Salam A. Wintertime black carbon assessment in Dhaka, Bangladesh: Integrated health risk analysis.</w:t>
+      </w:r>
+      <w:r>
+        <w:t xml:space="preserve"> </w:t>
+      </w:r>
+      <w:r>
+        <w:rPr>
+          <w:i/>
+          <w:iCs/>
+        </w:rPr>
+        <w:t xml:space="preserve">Heliyon</w:t>
+      </w:r>
+      <w:r>
+        <w:t xml:space="preserve">. 2025;11(2):e41809. https://doi.org/10.1016/j.heliyon.2025.e41809</w:t>
+      </w:r>
+    </w:p>
+    <w:p>
+      <w:pPr>
+        <w:pStyle w:val="Compact"/>
+        <w:numPr>
+          <w:ilvl w:val="0"/>
+          <w:numId w:val="1001"/>
+        </w:numPr>
+      </w:pPr>
+      <w:r>
+        <w:t xml:space="preserve">Bangladesh Department of Environment.</w:t>
+      </w:r>
+      <w:r>
+        <w:t xml:space="preserve"> </w:t>
+      </w:r>
+      <w:r>
+        <w:rPr>
+          <w:i/>
+          <w:iCs/>
+        </w:rPr>
+        <w:t xml:space="preserve">Bangladesh National Air Quality Management Plan 2024-2030</w:t>
+      </w:r>
+      <w:r>
+        <w:t xml:space="preserve">. Published 7 November 2024. https://doe.gov.bd/pages/publications/bangladesh-national-air-quality-management-plan-2024-2030-469099-6922da4f81fc96cef9eb5ec2</w:t>
+      </w:r>
+    </w:p>
+    <w:bookmarkEnd w:id="49"/>
     <w:sectPr>
       <w:footnotePr>
         <w:numRestart w:val="eachSect"/>

</xml_diff>